<commit_message>
Quita colaboración directa de SS y simplifica preaviso de cese (Sidero)
- Elimina el campo COLABORACION_DIRECTA del texto de Seguridad Social
  (ya no se pregunta en la web).
- Reescribe la cláusula de extinción de Siderometalúrgica Badajoz para
  no fijar un plazo de preaviso concreto, remitiendo a los plazos y
  formalidades que correspondan en cada caso.
- Regenera catalogo.json y el modelo común _base.docx.

Co-Authored-By: Claude Sonnet 5 <noreply@anthropic.com>
Claude-Session: https://claude.ai/code/session_0115e7WFpmvFzxU2JvKFzNiU
</commit_message>
<xml_diff>
--- a/public/modelos/_comun/_base.docx
+++ b/public/modelos/_comun/_base.docx
@@ -1707,16 +1707,6 @@
           <w:shd w:val="solid" w:color="00FFFF" w:fill="FF0000"/>
         </w:rPr>
         <w:t>{{SISTEMA_SS|p. ej. INSS y mutua X para contingencias profesionales e IT común}}</w:t>
-      </w:r>
-      <w:r>
-        <w:t xml:space="preserve">. Colaboración directa de la empresa: </w:t>
-      </w:r>
-      <w:r>
-        <w:rPr>
-          <w:b/>
-          <w:shd w:val="solid" w:color="00FFFF" w:fill="FF0000"/>
-        </w:rPr>
-        <w:t>{{COLABORACION_DIRECTA|colaboración directa o «no existe»}}</w:t>
       </w:r>
       <w:r>
         <w:t xml:space="preserve">. Mejoras voluntarias de la acción protectora: </w:t>

</xml_diff>